<commit_message>
Add 50/50 contributions section to the final report
</commit_message>
<xml_diff>
--- a/submission/report/Tashkent_Transit_Walkability_Final_Report.docx
+++ b/submission/report/Tashkent_Transit_Walkability_Final_Report.docx
@@ -2565,6 +2565,51 @@
         <w:pStyle w:val="Heading1"/>
       </w:pPr>
       <w:r>
+        <w:t>Contributions</w:t>
+      </w:r>
+    </w:p>
+    <w:p>
+      <w:r>
+        <w:rPr>
+          <w:b w:val="0"/>
+          <w:i w:val="0"/>
+        </w:rPr>
+        <w:t xml:space="preserve">Both members contributed equally (50/50). </w:t>
+      </w:r>
+      <w:r>
+        <w:rPr>
+          <w:b/>
+          <w:i w:val="0"/>
+        </w:rPr>
+        <w:t>Doniyor Erkinov</w:t>
+      </w:r>
+      <w:r>
+        <w:rPr>
+          <w:b w:val="0"/>
+          <w:i w:val="0"/>
+        </w:rPr>
+        <w:t xml:space="preserve"> led data acquisition and cleaning (OpenStreetMap, SIAT and WorldPop), population calibration, validation and documentation, and wrote the final report and poster. </w:t>
+      </w:r>
+      <w:r>
+        <w:rPr>
+          <w:b/>
+          <w:i w:val="0"/>
+        </w:rPr>
+        <w:t>Saidkamolkhon Bakhodirov</w:t>
+      </w:r>
+      <w:r>
+        <w:rPr>
+          <w:b w:val="0"/>
+          <w:i w:val="0"/>
+        </w:rPr>
+        <w:t xml:space="preserve"> led the network-routing analysis, visualization design, the D3 and MapLibre implementation, linked interactions and deployment. Both defined the research questions, interpreted the results and prepared the presentation.</w:t>
+      </w:r>
+    </w:p>
+    <w:p>
+      <w:pPr>
+        <w:pStyle w:val="Heading1"/>
+      </w:pPr>
+      <w:r>
         <w:t>References</w:t>
       </w:r>
     </w:p>

</xml_diff>